<commit_message>
feat(courseware): v48 deck, LG 6.5, LP 3.2 — BPA flow, HR agent, AI-assisted capstone
- Topic 1 now opens with why agentic AI (history of AI, agentic AI vs AI
  agents, workflow first vs agent first, business value, use cases, AI
  security) before n8n is introduced, following TGS-2024045801 v2.5
- LMS OTP login, n8n training accounts, sign-in, n8n Editor, free Gateway
  credits and n8n Assistant (with a social-media demo) in Topic 1
- Activity 4a is now the HR Policy Chatbot (Ava) on Telegram, built with
  n8n Assistant; reference workflow with memory added
- Mini capstone built with n8n Assistant: video creation example prompt,
  more example prompts and the Assistant screenshot
- New Activity 1 and 7b screenshots; LG/LP aligned; README standardised
  with verified registration link, duration and funding

Co-Authored-By: Claude Opus 5.5 <noreply@anthropic.com>
</commit_message>
<xml_diff>
--- a/courseware/LP-Agentic AI Automation with n8n.docx
+++ b/courseware/LP-Agentic AI Automation with n8n.docx
@@ -218,7 +218,7 @@
           <w:color w:val="1F6FEB"/>
           <w:sz w:val="24"/>
         </w:rPr>
-        <w:t>Version 3.1</w:t>
+        <w:t>Version 3.2</w:t>
       </w:r>
     </w:p>
     <w:p>
@@ -554,6 +554,64 @@
           </w:p>
         </w:tc>
       </w:tr>
+      <w:tr>
+        <w:tc>
+          <w:tcPr>
+            <w:tcW w:type="dxa" w:w="2160"/>
+          </w:tcPr>
+          <w:p>
+            <w:r/>
+            <w:r>
+              <w:rPr>
+                <w:sz w:val="19"/>
+              </w:rPr>
+              <w:t>3.2</w:t>
+            </w:r>
+          </w:p>
+        </w:tc>
+        <w:tc>
+          <w:tcPr>
+            <w:tcW w:type="dxa" w:w="2160"/>
+          </w:tcPr>
+          <w:p>
+            <w:r/>
+            <w:r>
+              <w:rPr>
+                <w:sz w:val="19"/>
+              </w:rPr>
+              <w:t>17 Oct 2026</w:t>
+            </w:r>
+          </w:p>
+        </w:tc>
+        <w:tc>
+          <w:tcPr>
+            <w:tcW w:type="dxa" w:w="2160"/>
+          </w:tcPr>
+          <w:p>
+            <w:r/>
+            <w:r>
+              <w:rPr>
+                <w:sz w:val="19"/>
+              </w:rPr>
+              <w:t>Aligned with slide deck v48: learners sign in with assigned n8n training accounts (no self sign-up) and use the free n8n Gateway credits for AI agents (API keys optional); Topic 1 now opens with why agentic AI and workflow first vs agent first before n8n is introduced; Activity 4a is the HR Policy Chatbot built with n8n Assistant; the mini capstone is built with n8n Assistant</w:t>
+            </w:r>
+          </w:p>
+        </w:tc>
+        <w:tc>
+          <w:tcPr>
+            <w:tcW w:type="dxa" w:w="2160"/>
+          </w:tcPr>
+          <w:p>
+            <w:r/>
+            <w:r>
+              <w:rPr>
+                <w:sz w:val="19"/>
+              </w:rPr>
+              <w:t>Tertiary Infotech Academy Pte Ltd</w:t>
+            </w:r>
+          </w:p>
+        </w:tc>
+      </w:tr>
     </w:tbl>
     <w:p>
       <w:r>
@@ -574,136 +632,12 @@
       </w:r>
     </w:p>
     <w:p>
-      <w:pPr>
-        <w:tabs>
-          <w:tab w:pos="9072" w:val="right" w:leader="dot"/>
-        </w:tabs>
-        <w:spacing w:after="60"/>
-      </w:pPr>
       <w:r>
-        <w:rPr>
-          <w:rFonts w:ascii="Arial" w:hAnsi="Arial"/>
-          <w:b/>
-          <w:color w:val="333333"/>
-          <w:sz w:val="22"/>
-        </w:rPr>
-        <w:t>Course Overview</w:t>
-        <w:tab/>
-        <w:t>4</w:t>
-      </w:r>
-    </w:p>
-    <w:p>
-      <w:pPr>
-        <w:tabs>
-          <w:tab w:pos="9072" w:val="right" w:leader="dot"/>
-        </w:tabs>
-        <w:spacing w:after="60"/>
-      </w:pPr>
-      <w:r>
-        <w:rPr>
-          <w:rFonts w:ascii="Arial" w:hAnsi="Arial"/>
-          <w:b/>
-          <w:color w:val="333333"/>
-          <w:sz w:val="22"/>
-        </w:rPr>
-        <w:t>Learning Outcomes</w:t>
-        <w:tab/>
-        <w:t>4</w:t>
-      </w:r>
-    </w:p>
-    <w:p>
-      <w:pPr>
-        <w:tabs>
-          <w:tab w:pos="9072" w:val="right" w:leader="dot"/>
-        </w:tabs>
-        <w:spacing w:after="60"/>
-      </w:pPr>
-      <w:r>
-        <w:rPr>
-          <w:rFonts w:ascii="Arial" w:hAnsi="Arial"/>
-          <w:b/>
-          <w:color w:val="333333"/>
-          <w:sz w:val="22"/>
-        </w:rPr>
-        <w:t>Day 1</w:t>
-        <w:tab/>
-        <w:t>5</w:t>
-      </w:r>
-    </w:p>
-    <w:p>
-      <w:pPr>
-        <w:tabs>
-          <w:tab w:pos="9072" w:val="right" w:leader="dot"/>
-        </w:tabs>
-        <w:spacing w:after="60"/>
-      </w:pPr>
-      <w:r>
-        <w:rPr>
-          <w:rFonts w:ascii="Arial" w:hAnsi="Arial"/>
-          <w:b/>
-          <w:color w:val="333333"/>
-          <w:sz w:val="22"/>
-        </w:rPr>
-        <w:t>Day 2</w:t>
-        <w:tab/>
-        <w:t>6</w:t>
-      </w:r>
-    </w:p>
-    <w:p>
-      <w:pPr>
-        <w:tabs>
-          <w:tab w:pos="9072" w:val="right" w:leader="dot"/>
-        </w:tabs>
-        <w:spacing w:after="60"/>
-      </w:pPr>
-      <w:r>
-        <w:rPr>
-          <w:rFonts w:ascii="Arial" w:hAnsi="Arial"/>
-          <w:b/>
-          <w:color w:val="333333"/>
-          <w:sz w:val="22"/>
-        </w:rPr>
-        <w:t>Day 3</w:t>
-        <w:tab/>
-        <w:t>7</w:t>
-      </w:r>
-    </w:p>
-    <w:p>
-      <w:pPr>
-        <w:tabs>
-          <w:tab w:pos="9072" w:val="right" w:leader="dot"/>
-        </w:tabs>
-        <w:spacing w:after="60"/>
-      </w:pPr>
-      <w:r>
-        <w:rPr>
-          <w:rFonts w:ascii="Arial" w:hAnsi="Arial"/>
-          <w:b/>
-          <w:color w:val="333333"/>
-          <w:sz w:val="22"/>
-        </w:rPr>
-        <w:t>Tools, Accounts &amp; Resources</w:t>
-        <w:tab/>
-        <w:t>8</w:t>
-      </w:r>
-    </w:p>
-    <w:p>
-      <w:pPr>
-        <w:tabs>
-          <w:tab w:pos="9072" w:val="right" w:leader="dot"/>
-        </w:tabs>
-        <w:spacing w:after="60"/>
-      </w:pPr>
-      <w:r>
-        <w:rPr>
-          <w:rFonts w:ascii="Arial" w:hAnsi="Arial"/>
-          <w:b/>
-          <w:color w:val="333333"/>
-          <w:sz w:val="22"/>
-        </w:rPr>
-        <w:t>Assessment</w:t>
-        <w:tab/>
-        <w:t>8</w:t>
+        <w:fldChar w:fldCharType="begin"/>
+        <w:instrText xml:space="preserve">TOC \o "1-2" \h \z \u</w:instrText>
+        <w:fldChar w:fldCharType="separate"/>
+        <w:t>Right-click and choose “Update Field”, or press F9, to build the table of contents.</w:t>
+        <w:fldChar w:fldCharType="end"/>
       </w:r>
     </w:p>
     <w:p>
@@ -1041,7 +975,7 @@
                 <w:i w:val="0"/>
                 <w:sz w:val="20"/>
               </w:rPr>
-              <w:t>n8n (trial + local Docker), OpenAI &amp; Gemini API keys, Telegram, Gmail/Outlook, Google Sheets, Twelve Data &amp; NewsAPI, Claude Code</w:t>
+              <w:t>n8n (assigned training accounts + local Docker), free n8n Gateway credits (API keys optional), Telegram, Gmail/Outlook, Google Sheets, Twelve Data &amp; NewsAPI, Claude Code</w:t>
             </w:r>
           </w:p>
         </w:tc>
@@ -1341,7 +1275,7 @@
                 <w:i w:val="0"/>
                 <w:sz w:val="19"/>
               </w:rPr>
-              <w:t>9:45 – 12:25</w:t>
+              <w:t>9:45 – 1:00</w:t>
             </w:r>
           </w:p>
         </w:tc>
@@ -1400,7 +1334,7 @@
                 <w:i w:val="0"/>
                 <w:sz w:val="19"/>
               </w:rPr>
-              <w:t>9:45 – 10:05</w:t>
+              <w:t>9:45 – 10:15</w:t>
             </w:r>
           </w:p>
         </w:tc>
@@ -1416,7 +1350,7 @@
                 <w:i w:val="0"/>
                 <w:sz w:val="19"/>
               </w:rPr>
-              <w:t>Overview of n8n</w:t>
+              <w:t>Why agentic AI, and why workflow first — history of AI, generative vs agentic AI, agentic AI vs AI agents, workflow first vs agent first, business value, AI security; overview of n8n</w:t>
             </w:r>
           </w:p>
         </w:tc>
@@ -1435,7 +1369,7 @@
                 <w:i w:val="0"/>
                 <w:sz w:val="19"/>
               </w:rPr>
-              <w:t>20 min</w:t>
+              <w:t>30 min</w:t>
             </w:r>
           </w:p>
         </w:tc>
@@ -1456,7 +1390,7 @@
                 <w:i w:val="0"/>
                 <w:sz w:val="19"/>
               </w:rPr>
-              <w:t>10:05 – 10:35</w:t>
+              <w:t>10:15 – 10:35</w:t>
             </w:r>
           </w:p>
         </w:tc>
@@ -1472,7 +1406,7 @@
                 <w:i w:val="0"/>
                 <w:sz w:val="19"/>
               </w:rPr>
-              <w:t>Set up n8n — create trial accounts (15 learners) and install locally with Docker Compose</w:t>
+              <w:t>Set up n8n — sign in with the assigned n8n training accounts, claim the free AI (Gateway) credits, n8n Assistant demo; local install with Docker Compose shown</w:t>
             </w:r>
           </w:p>
         </w:tc>
@@ -1491,7 +1425,7 @@
                 <w:i w:val="0"/>
                 <w:sz w:val="19"/>
               </w:rPr>
-              <w:t>30 min</w:t>
+              <w:t>20 min</w:t>
             </w:r>
           </w:p>
         </w:tc>
@@ -2325,7 +2259,7 @@
                 <w:i w:val="0"/>
                 <w:sz w:val="19"/>
               </w:rPr>
-              <w:t>Activity 4a: Telegram-triggered AI Agent — simple customer-service chatbot (OpenAI / Gemini API key provided)</w:t>
+              <w:t>Activity 4a: Telegram HR Policy Chatbot (Ava) — create the bot with BotFather, build it with n8n Assistant from one prompt, connect, publish and chat (free n8n Gateway credits)</w:t>
             </w:r>
           </w:p>
         </w:tc>
@@ -2381,7 +2315,7 @@
                 <w:i w:val="0"/>
                 <w:sz w:val="19"/>
               </w:rPr>
-              <w:t>Activity 4b: Telegram-triggered AI Agent (customer service / HR admin) — attach a Data Table as a tool; reuse Activity 2 data or upload a 100-record employee CSV</w:t>
+              <w:t>Activity 4b: Give Ava a tool — attach an Employees Data Table (reuse Activity 2 data or upload a 100-record employee CSV) so she answers from real staff records</w:t>
             </w:r>
           </w:p>
         </w:tc>
@@ -4669,7 +4603,7 @@
                 <w:i w:val="0"/>
                 <w:sz w:val="19"/>
               </w:rPr>
-              <w:t>Capstone briefing — requirements, scope and assessment criteria</w:t>
+              <w:t>Capstone briefing — requirements, scope and assessment criteria; AI-assisted workflow creation with n8n Assistant (example prompt: end-to-end video creation — topic, research, script, production, publish)</w:t>
             </w:r>
           </w:p>
         </w:tc>
@@ -4725,7 +4659,7 @@
                 <w:i w:val="0"/>
                 <w:sz w:val="19"/>
               </w:rPr>
-              <w:t>Mini capstone build (supervised lab time)</w:t>
+              <w:t>Mini capstone build (supervised lab time) — describe the process to n8n Assistant, review and connect credentials, test and add a guardrail or approval step</w:t>
             </w:r>
           </w:p>
         </w:tc>
@@ -5142,7 +5076,7 @@
                 <w:color w:val="111827"/>
                 <w:sz w:val="19"/>
               </w:rPr>
-              <w:t>LLM API keys</w:t>
+              <w:t>LLM access</w:t>
             </w:r>
           </w:p>
         </w:tc>
@@ -5159,7 +5093,7 @@
                 <w:color w:val="1F6FEB"/>
                 <w:sz w:val="19"/>
               </w:rPr>
-              <w:t>OpenAI API key &amp; Google Gemini API key (provided to learners)</w:t>
+              <w:t>Free n8n Gateway credits on each training account; OpenAI / Google Gemini API keys optional</w:t>
             </w:r>
           </w:p>
         </w:tc>

</xml_diff>